<commit_message>
Set the Growth monthly value to R$ 7.457,82
Last slide only: table still R$ 11.000, EE abatement unchanged,
commercial condition now R$ 2.324,51 so 11.000 − 1.217,67 − 2.324,51
= 12× R$ 7.457,82. Internal script and flow match.

Co-authored-by: sarapizzico-hue <sarapizzico-hue@users.noreply.github.com>
</commit_message>
<xml_diff>
--- a/fluxo-mbflex-narrativa.docx
+++ b/fluxo-mbflex-narrativa.docx
@@ -1274,7 +1274,9 @@
             <w:pPr>
               <w:spacing w:after="0" w:before="0"/>
             </w:pPr>
-            <w:r/>
+            <w:r>
+              <w:t>Tabela 11.000 − EE 1.217,67 − condição 2.324,51 = 12× R$ 7.457,82. Anúncio à parte.</w:t>
+            </w:r>
             <w:r>
               <w:rPr>
                 <w:rFonts w:ascii="Calibri" w:hAnsi="Calibri" w:eastAsia="Calibri"/>
@@ -1283,7 +1285,6 @@
                 <w:color w:val="1A1A1A"/>
                 <w:sz w:val="20"/>
               </w:rPr>
-              <w:t>Tabela 11.000 − EE 1.217,67 − condição 523,02 = 12× R$ 9.259,31. Anúncio à parte.</w:t>
             </w:r>
           </w:p>
         </w:tc>

</xml_diff>

<commit_message>
Update MBFlex last-slide price to 12x R$7.457,82 on GitHub Pages
Co-authored-by: sarapizzico-hue <sarapizzico-hue@users.noreply.github.com>
</commit_message>
<xml_diff>
--- a/fluxo-mbflex-narrativa.docx
+++ b/fluxo-mbflex-narrativa.docx
@@ -1274,7 +1274,9 @@
             <w:pPr>
               <w:spacing w:after="0" w:before="0"/>
             </w:pPr>
-            <w:r/>
+            <w:r>
+              <w:t>Tabela 11.000 − EE 1.217,67 − condição 2.324,51 = 12× R$ 7.457,82. Anúncio à parte.</w:t>
+            </w:r>
             <w:r>
               <w:rPr>
                 <w:rFonts w:ascii="Calibri" w:hAnsi="Calibri" w:eastAsia="Calibri"/>
@@ -1283,7 +1285,6 @@
                 <w:color w:val="1A1A1A"/>
                 <w:sz w:val="20"/>
               </w:rPr>
-              <w:t>Tabela 11.000 − EE 1.217,67 − condição 523,02 = 12× R$ 9.259,31. Anúncio à parte.</w:t>
             </w:r>
           </w:p>
         </w:tc>

</xml_diff>